<commit_message>
docs: fix section numbering in md and regenerate ND 30 compliant DOCX files with bold headings
</commit_message>
<xml_diff>
--- a/tailieu-mota-tinhnang-erp-ibst-gui-khach-hang.docx
+++ b/tailieu-mota-tinhnang-erp-ibst-gui-khach-hang.docx
@@ -6,14 +6,10 @@
       <w:pPr>
         <w:spacing w:before="480" w:after="240"/>
         <w:jc w:val="center"/>
-        <w:rPr>
-          <w:b/>
-          <w:sz w:val="32"/>
-        </w:rPr>
-      </w:pPr>
-      <w:r>
-        <w:rPr>
-          <w:b w:val="false"/>
+      </w:pPr>
+      <w:r>
+        <w:rPr>
+          <w:b/>
           <w:sz w:val="32"/>
         </w:rPr>
         <w:t xml:space="preserve">BẢNG MÔ TẢ TÍNH NĂNG CHI TIẾT HỆ THỐNG ERP TÍCH HỢP IBST</w:t>
@@ -23,17 +19,13 @@
       <w:pPr>
         <w:spacing w:after="480"/>
         <w:jc w:val="center"/>
-        <w:rPr>
+      </w:pPr>
+      <w:r>
+        <w:rPr>
+          <w:b w:val="false"/>
           <w:i/>
           <w:sz w:val="24"/>
         </w:rPr>
-      </w:pPr>
-      <w:r>
-        <w:rPr>
-          <w:b w:val="false"/>
-          <w:i/>
-          <w:sz w:val="24"/>
-        </w:rPr>
         <w:t xml:space="preserve">Tài liệu kỹ thuật đồng hành cùng hồ sơ năng lực gửi đối tác / chủ đầu tư</w:t>
       </w:r>
     </w:p>
@@ -96,6 +88,18 @@
           <w:b w:val="false"/>
         </w:rPr>
         <w:t xml:space="preserve"> (Danh mục dữ liệu mở ngành Xây dựng).</w:t>
+      </w:r>
+    </w:p>
+    <w:p>
+      <w:pPr>
+        <w:spacing w:before="360" w:after="120"/>
+      </w:pPr>
+      <w:r>
+        <w:rPr>
+          <w:b/>
+          <w:sz w:val="28"/>
+        </w:rPr>
+        <w:t xml:space="preserve">1. Danh sách các Phân hệ Nghiệp vụ</w:t>
       </w:r>
     </w:p>
     <w:p>
@@ -1062,17 +1066,13 @@
     <w:p>
       <w:pPr>
         <w:spacing w:before="360" w:after="120"/>
+      </w:pPr>
+      <w:r>
         <w:rPr>
           <w:b/>
           <w:sz w:val="28"/>
         </w:rPr>
-      </w:pPr>
-      <w:r>
-        <w:rPr>
-          <w:b w:val="false"/>
-          <w:sz w:val="28"/>
-        </w:rPr>
-        <w:t xml:space="preserve">Các Giải pháp Công nghệ Tiên tiến &amp; Tính năng Ưu việt</w:t>
+        <w:t xml:space="preserve">2. Các Giải pháp Công nghệ Tiên tiến &amp; Tính năng Ưu việt</w:t>
       </w:r>
     </w:p>
     <w:p>
@@ -1091,17 +1091,63 @@
     <w:p>
       <w:pPr>
         <w:spacing w:before="240" w:after="80"/>
+      </w:pPr>
+      <w:r>
         <w:rPr>
           <w:b/>
           <w:sz w:val="26"/>
         </w:rPr>
-      </w:pPr>
-      <w:r>
-        <w:rPr>
-          <w:b w:val="false"/>
+        <w:t xml:space="preserve">1. Công nghệ Xác thực văn bản số thông qua Mã QR động &amp; Chữ ký số pháp lý (QR-Secure Certificate)</w:t>
+      </w:r>
+    </w:p>
+    <w:p>
+      <w:pPr>
+        <w:spacing w:after="60"/>
+        <w:ind w:left="360"/>
+        <w:jc w:val="both"/>
+      </w:pPr>
+      <w:r>
+        <w:rPr>
+          <w:b w:val="false"/>
+        </w:rPr>
+        <w:t xml:space="preserve">- Mô tả giải pháp:</w:t>
+      </w:r>
+      <w:r>
+        <w:rPr>
+          <w:b/>
+        </w:rPr>
+        <w:t xml:space="preserve"> Số hóa toàn diện quy trình kiểm soát tính toàn vẹn và pháp lý của các tài liệu kỹ thuật, Phiếu kết quả thử nghiệm và Chứng chỉ kiểm định do Viện cấp.</w:t>
+      </w:r>
+    </w:p>
+    <w:p>
+      <w:pPr>
+        <w:spacing w:after="60"/>
+        <w:ind w:left="360"/>
+        <w:jc w:val="both"/>
+      </w:pPr>
+      <w:r>
+        <w:rPr>
+          <w:b w:val="false"/>
+        </w:rPr>
+        <w:t xml:space="preserve">- Hiệu quả ứng dụng:</w:t>
+      </w:r>
+      <w:r>
+        <w:rPr>
+          <w:b/>
+        </w:rPr>
+        <w:t xml:space="preserve"> Toàn bộ các văn bản điện tử và phiếu kết quả kết xuất từ hệ thống LIMS được tự động ký số bằng chữ ký số cơ quan. Đồng thời, hệ thống tự động thiết lập một mã QR động duy nhất in chìm tại chân trang. Cơ quan quản lý, chủ đầu tư hoặc đơn vị thanh tra xây dựng có thể quét mã QR này để truy xuất tức thì tệp gốc lưu trữ tại máy chủ an toàn của Viện nhằm đối chiếu dữ liệu, loại bỏ hoàn toàn rủi ro giả mạo tài liệu kiểm định trên thị trường.</w:t>
+      </w:r>
+    </w:p>
+    <w:p>
+      <w:pPr>
+        <w:spacing w:before="240" w:after="80"/>
+      </w:pPr>
+      <w:r>
+        <w:rPr>
+          <w:b/>
           <w:sz w:val="26"/>
         </w:rPr>
-        <w:t xml:space="preserve">Công nghệ Xác thực văn bản số thông qua Mã QR động &amp; Chữ ký số pháp lý (QR-Secure Certificate)</w:t>
+        <w:t xml:space="preserve">2. Giải pháp Trí tuệ nhân tạo hỗ trợ tra cứu văn bản quy phạm kỹ thuật xây dựng (AI-RAG)</w:t>
       </w:r>
     </w:p>
     <w:p>
@@ -1120,7 +1166,7 @@
         <w:rPr>
           <w:b/>
         </w:rPr>
-        <w:t xml:space="preserve"> Số hóa toàn diện quy trình kiểm soát tính toàn vẹn và pháp lý của các tài liệu kỹ thuật, Phiếu kết quả thử nghiệm và Chứng chỉ kiểm định do Viện cấp.</w:t>
+        <w:t xml:space="preserve"> Ứng dụng mô hình ngôn ngữ lớn kết hợp cơ chế truy xuất dữ liệu tăng cường (RAG) trên kho tư liệu khoa học kỹ thuật và quy chuẩn chuyên ngành của Viện.</w:t>
       </w:r>
     </w:p>
     <w:p>
@@ -1139,23 +1185,69 @@
         <w:rPr>
           <w:b/>
         </w:rPr>
-        <w:t xml:space="preserve"> Toàn bộ các văn bản điện tử và phiếu kết quả kết xuất từ hệ thống LIMS được tự động ký số bằng chữ ký số cơ quan. Đồng thời, hệ thống tự động thiết lập một mã QR động duy nhất in chìm tại chân trang. Cơ quan quản lý, chủ đầu tư hoặc đơn vị thanh tra xây dựng có thể quét mã QR này để truy xuất tức thì tệp gốc lưu trữ tại máy chủ an toàn của Viện nhằm đối chiếu dữ liệu, loại bỏ hoàn toàn rủi ro giả mạo tài liệu kiểm định trên thị trường.</w:t>
+        <w:t xml:space="preserve"> Hỗ trợ cán bộ nghiên cứu và kỹ sư thiết kế tra cứu nhanh các quy định kỹ thuật bằng ngôn ngữ tự nhiên (Ví dụ: *"Yêu cầu về giới hạn chịu lửa của cấu kiện chịu lực đối với nhà cao tầng theo QCVN 06:2022 là gì?"*). Trợ lý AI sẽ tự động phân tích kho văn bản số hóa, trích xuất chính xác điều khoản, chương mục liên quan và hiển thị văn bản gốc để phục vụ công tác đối chiếu thiết kế và lập thuyết minh đề tài, rút ngắn 90% thời gian tra cứu.</w:t>
       </w:r>
     </w:p>
     <w:p>
       <w:pPr>
         <w:spacing w:before="240" w:after="80"/>
+      </w:pPr>
+      <w:r>
         <w:rPr>
           <w:b/>
           <w:sz w:val="26"/>
         </w:rPr>
-      </w:pPr>
-      <w:r>
-        <w:rPr>
-          <w:b w:val="false"/>
+        <w:t xml:space="preserve">3. Hệ thống Tự động hóa Cảnh báo Đa phương thức (Omnichannel Alerts)</w:t>
+      </w:r>
+    </w:p>
+    <w:p>
+      <w:pPr>
+        <w:spacing w:after="60"/>
+        <w:ind w:left="360"/>
+        <w:jc w:val="both"/>
+      </w:pPr>
+      <w:r>
+        <w:rPr>
+          <w:b w:val="false"/>
+        </w:rPr>
+        <w:t xml:space="preserve">- Mô tả giải pháp:</w:t>
+      </w:r>
+      <w:r>
+        <w:rPr>
+          <w:b/>
+        </w:rPr>
+        <w:t xml:space="preserve"> Cơ chế tự động quét dữ liệu định kỳ để phát hiện các thời hạn hành chính, tài chính và kỹ thuật quan trọng.</w:t>
+      </w:r>
+    </w:p>
+    <w:p>
+      <w:pPr>
+        <w:spacing w:after="60"/>
+        <w:ind w:left="360"/>
+        <w:jc w:val="both"/>
+      </w:pPr>
+      <w:r>
+        <w:rPr>
+          <w:b w:val="false"/>
+        </w:rPr>
+        <w:t xml:space="preserve">- Hiệu quả ứng dụng:</w:t>
+      </w:r>
+      <w:r>
+        <w:rPr>
+          <w:b/>
+        </w:rPr>
+        <w:t xml:space="preserve"> Tự động gửi thông tin nhắc nhở đa kênh (hệ thống thông báo nội bộ, Email công vụ, tin nhắn bảo mật Zalo ZNS) tới cán bộ phụ trách và Lãnh đạo Viện khi có dữ liệu phát sinh: Thiết bị thí nghiệm đến hạn kiểm định/hiệu chuẩn định kỳ, công nợ quá hạn của khách hàng, hoặc thời hạn nghiệm thu đề tài KHCN sự nghiệp.</w:t>
+      </w:r>
+    </w:p>
+    <w:p>
+      <w:pPr>
+        <w:spacing w:before="240" w:after="80"/>
+      </w:pPr>
+      <w:r>
+        <w:rPr>
+          <w:b/>
           <w:sz w:val="26"/>
         </w:rPr>
-        <w:t xml:space="preserve">Giải pháp Trí tuệ nhân tạo hỗ trợ tra cứu văn bản quy phạm kỹ thuật xây dựng (AI-RAG)</w:t>
+        <w:t xml:space="preserve">4. Chế độ hiển thị tối ưu hóa thị giác theo môi trường làm việc (Multi-theme Adaptability)</w:t>
       </w:r>
     </w:p>
     <w:p>
@@ -1174,7 +1266,7 @@
         <w:rPr>
           <w:b/>
         </w:rPr>
-        <w:t xml:space="preserve"> Ứng dụng mô hình ngôn ngữ lớn kết hợp cơ chế truy xuất dữ liệu tăng cường (RAG) trên kho tư liệu khoa học kỹ thuật và quy chuẩn chuyên ngành của Viện.</w:t>
+        <w:t xml:space="preserve"> Thiết kế giao diện đa chế độ màu sắc thích ứng linh hoạt theo thời gian thực.</w:t>
       </w:r>
     </w:p>
     <w:p>
@@ -1193,114 +1285,6 @@
         <w:rPr>
           <w:b/>
         </w:rPr>
-        <w:t xml:space="preserve"> Hỗ trợ cán bộ nghiên cứu và kỹ sư thiết kế tra cứu nhanh các quy định kỹ thuật bằng ngôn ngữ tự nhiên (Ví dụ: *"Yêu cầu về giới hạn chịu lửa của cấu kiện chịu lực đối với nhà cao tầng theo QCVN 06:2022 là gì?"*). Trợ lý AI sẽ tự động phân tích kho văn bản số hóa, trích xuất chính xác điều khoản, chương mục liên quan và hiển thị văn bản gốc để phục vụ công tác đối chiếu thiết kế và lập thuyết minh đề tài, rút ngắn 90% thời gian tra cứu.</w:t>
-      </w:r>
-    </w:p>
-    <w:p>
-      <w:pPr>
-        <w:spacing w:before="240" w:after="80"/>
-        <w:rPr>
-          <w:b/>
-          <w:sz w:val="26"/>
-        </w:rPr>
-      </w:pPr>
-      <w:r>
-        <w:rPr>
-          <w:b w:val="false"/>
-          <w:sz w:val="26"/>
-        </w:rPr>
-        <w:t xml:space="preserve">Hệ thống Tự động hóa Cảnh báo Đa phương thức (Omnichannel Alerts)</w:t>
-      </w:r>
-    </w:p>
-    <w:p>
-      <w:pPr>
-        <w:spacing w:after="60"/>
-        <w:ind w:left="360"/>
-        <w:jc w:val="both"/>
-      </w:pPr>
-      <w:r>
-        <w:rPr>
-          <w:b w:val="false"/>
-        </w:rPr>
-        <w:t xml:space="preserve">- Mô tả giải pháp:</w:t>
-      </w:r>
-      <w:r>
-        <w:rPr>
-          <w:b/>
-        </w:rPr>
-        <w:t xml:space="preserve"> Cơ chế tự động quét dữ liệu định kỳ để phát hiện các thời hạn hành chính, tài chính và kỹ thuật quan trọng.</w:t>
-      </w:r>
-    </w:p>
-    <w:p>
-      <w:pPr>
-        <w:spacing w:after="60"/>
-        <w:ind w:left="360"/>
-        <w:jc w:val="both"/>
-      </w:pPr>
-      <w:r>
-        <w:rPr>
-          <w:b w:val="false"/>
-        </w:rPr>
-        <w:t xml:space="preserve">- Hiệu quả ứng dụng:</w:t>
-      </w:r>
-      <w:r>
-        <w:rPr>
-          <w:b/>
-        </w:rPr>
-        <w:t xml:space="preserve"> Tự động gửi thông tin nhắc nhở đa kênh (hệ thống thông báo nội bộ, Email công vụ, tin nhắn bảo mật Zalo ZNS) tới cán bộ phụ trách và Lãnh đạo Viện khi có dữ liệu phát sinh: Thiết bị thí nghiệm đến hạn kiểm định/hiệu chuẩn định kỳ, công nợ quá hạn của khách hàng, hoặc thời hạn nghiệm thu đề tài KHCN sự nghiệp.</w:t>
-      </w:r>
-    </w:p>
-    <w:p>
-      <w:pPr>
-        <w:spacing w:before="240" w:after="80"/>
-        <w:rPr>
-          <w:b/>
-          <w:sz w:val="26"/>
-        </w:rPr>
-      </w:pPr>
-      <w:r>
-        <w:rPr>
-          <w:b w:val="false"/>
-          <w:sz w:val="26"/>
-        </w:rPr>
-        <w:t xml:space="preserve">Chế độ hiển thị tối ưu hóa thị giác theo môi trường làm việc (Multi-theme Adaptability)</w:t>
-      </w:r>
-    </w:p>
-    <w:p>
-      <w:pPr>
-        <w:spacing w:after="60"/>
-        <w:ind w:left="360"/>
-        <w:jc w:val="both"/>
-      </w:pPr>
-      <w:r>
-        <w:rPr>
-          <w:b w:val="false"/>
-        </w:rPr>
-        <w:t xml:space="preserve">- Mô tả giải pháp:</w:t>
-      </w:r>
-      <w:r>
-        <w:rPr>
-          <w:b/>
-        </w:rPr>
-        <w:t xml:space="preserve"> Thiết kế giao diện đa chế độ màu sắc thích ứng linh hoạt theo thời gian thực.</w:t>
-      </w:r>
-    </w:p>
-    <w:p>
-      <w:pPr>
-        <w:spacing w:after="60"/>
-        <w:ind w:left="360"/>
-        <w:jc w:val="both"/>
-      </w:pPr>
-      <w:r>
-        <w:rPr>
-          <w:b w:val="false"/>
-        </w:rPr>
-        <w:t xml:space="preserve">- Hiệu quả ứng dụng:</w:t>
-      </w:r>
-      <w:r>
-        <w:rPr>
-          <w:b/>
-        </w:rPr>
         <w:t xml:space="preserve"> Người dùng có thể chuyển đổi linh hoạt giữa 3 giao diện:</w:t>
       </w:r>
     </w:p>
@@ -1346,17 +1330,13 @@
     <w:p>
       <w:pPr>
         <w:spacing w:before="360" w:after="120"/>
+      </w:pPr>
+      <w:r>
         <w:rPr>
           <w:b/>
           <w:sz w:val="28"/>
         </w:rPr>
-      </w:pPr>
-      <w:r>
-        <w:rPr>
-          <w:b w:val="false"/>
-          <w:sz w:val="28"/>
-        </w:rPr>
-        <w:t xml:space="preserve">Giải pháp Công nghệ &amp; Kiến trúc Hạ tầng Tiêu chuẩn (Tech Stack)</w:t>
+        <w:t xml:space="preserve">3. Giải pháp Công nghệ &amp; Kiến trúc Hạ tầng Tiêu chuẩn (Tech Stack)</w:t>
       </w:r>
     </w:p>
     <w:p>
@@ -1375,17 +1355,99 @@
     <w:p>
       <w:pPr>
         <w:spacing w:before="240" w:after="80"/>
+      </w:pPr>
+      <w:r>
         <w:rPr>
           <w:b/>
           <w:sz w:val="26"/>
         </w:rPr>
-      </w:pPr>
-      <w:r>
-        <w:rPr>
-          <w:b w:val="false"/>
+        <w:t xml:space="preserve">1. Hạ tầng Máy chủ &amp; Lưu trữ dữ liệu nội địa (Domestic Cloud Hosting)</w:t>
+      </w:r>
+    </w:p>
+    <w:p>
+      <w:pPr>
+        <w:spacing w:after="60"/>
+        <w:ind w:left="360"/>
+        <w:jc w:val="both"/>
+      </w:pPr>
+      <w:r>
+        <w:rPr>
+          <w:b w:val="false"/>
+        </w:rPr>
+        <w:t xml:space="preserve">- Đối tác hạ tầng:</w:t>
+      </w:r>
+      <w:r>
+        <w:rPr>
+          <w:b/>
+        </w:rPr>
+        <w:t xml:space="preserve"> Hệ thống được cấu hình tối ưu để triển khai trên hạ tầng điện toán đám mây đạt tiêu chuẩn an toàn thông tin cao nhất tại Việt Nam (lựa chọn linh hoạt giữa </w:t>
+      </w:r>
+      <w:r>
+        <w:rPr>
+          <w:b w:val="false"/>
+        </w:rPr>
+        <w:t xml:space="preserve">Viettel Cloud</w:t>
+      </w:r>
+      <w:r>
+        <w:rPr>
+          <w:b/>
+        </w:rPr>
+        <w:t xml:space="preserve">, </w:t>
+      </w:r>
+      <w:r>
+        <w:rPr>
+          <w:b w:val="false"/>
+        </w:rPr>
+        <w:t xml:space="preserve">FPT Smart Cloud</w:t>
+      </w:r>
+      <w:r>
+        <w:rPr>
+          <w:b/>
+        </w:rPr>
+        <w:t xml:space="preserve">, hoặc </w:t>
+      </w:r>
+      <w:r>
+        <w:rPr>
+          <w:b w:val="false"/>
+        </w:rPr>
+        <w:t xml:space="preserve">VNPT Cloud</w:t>
+      </w:r>
+      <w:r>
+        <w:rPr>
+          <w:b/>
+        </w:rPr>
+        <w:t xml:space="preserve">).</w:t>
+      </w:r>
+    </w:p>
+    <w:p>
+      <w:pPr>
+        <w:spacing w:after="60"/>
+        <w:ind w:left="360"/>
+        <w:jc w:val="both"/>
+      </w:pPr>
+      <w:r>
+        <w:rPr>
+          <w:b w:val="false"/>
+        </w:rPr>
+        <w:t xml:space="preserve">- Bảo toàn chủ quyền dữ liệu:</w:t>
+      </w:r>
+      <w:r>
+        <w:rPr>
+          <w:b/>
+        </w:rPr>
+        <w:t xml:space="preserve"> Đảm bảo 100% dữ liệu của Viện IBST được lưu trữ vật lý trên các máy chủ đặt tại Việt Nam, tuân thủ tuyệt đối Nghị định 53/2022/NĐ-CP hướng dẫn Luật An ninh mạng.</w:t>
+      </w:r>
+    </w:p>
+    <w:p>
+      <w:pPr>
+        <w:spacing w:before="240" w:after="80"/>
+      </w:pPr>
+      <w:r>
+        <w:rPr>
+          <w:b/>
           <w:sz w:val="26"/>
         </w:rPr>
-        <w:t xml:space="preserve">Hạ tầng Máy chủ &amp; Lưu trữ dữ liệu nội địa (Domestic Cloud Hosting)</w:t>
+        <w:t xml:space="preserve">2. Chi tiết Lớp Công nghệ (Technology Stack)</w:t>
       </w:r>
     </w:p>
     <w:p>
@@ -1398,49 +1460,82 @@
         <w:rPr>
           <w:b w:val="false"/>
         </w:rPr>
-        <w:t xml:space="preserve">- Đối tác hạ tầng:</w:t>
-      </w:r>
-      <w:r>
-        <w:rPr>
-          <w:b/>
-        </w:rPr>
-        <w:t xml:space="preserve"> Hệ thống được cấu hình tối ưu để triển khai trên hạ tầng điện toán đám mây đạt tiêu chuẩn an toàn thông tin cao nhất tại Việt Nam (lựa chọn linh hoạt giữa </w:t>
-      </w:r>
-      <w:r>
-        <w:rPr>
-          <w:b w:val="false"/>
-        </w:rPr>
-        <w:t xml:space="preserve">Viettel Cloud</w:t>
-      </w:r>
-      <w:r>
-        <w:rPr>
-          <w:b/>
-        </w:rPr>
-        <w:t xml:space="preserve">, </w:t>
-      </w:r>
-      <w:r>
-        <w:rPr>
-          <w:b w:val="false"/>
-        </w:rPr>
-        <w:t xml:space="preserve">FPT Smart Cloud</w:t>
-      </w:r>
-      <w:r>
-        <w:rPr>
-          <w:b/>
-        </w:rPr>
-        <w:t xml:space="preserve">, hoặc </w:t>
-      </w:r>
-      <w:r>
-        <w:rPr>
-          <w:b w:val="false"/>
-        </w:rPr>
-        <w:t xml:space="preserve">VNPT Cloud</w:t>
-      </w:r>
-      <w:r>
-        <w:rPr>
-          <w:b/>
-        </w:rPr>
-        <w:t xml:space="preserve">).</w:t>
+        <w:t xml:space="preserve">- Lớp Giao diện (Frontend Client):</w:t>
+      </w:r>
+    </w:p>
+    <w:p>
+      <w:pPr>
+        <w:spacing w:after="60"/>
+        <w:ind w:left="720"/>
+        <w:jc w:val="both"/>
+      </w:pPr>
+      <w:r>
+        <w:rPr>
+          <w:b w:val="false"/>
+        </w:rPr>
+        <w:t xml:space="preserve">- Sử dụng thư viện </w:t>
+      </w:r>
+      <w:r>
+        <w:rPr>
+          <w:b/>
+        </w:rPr>
+        <w:t xml:space="preserve">React</w:t>
+      </w:r>
+      <w:r>
+        <w:rPr>
+          <w:b w:val="false"/>
+        </w:rPr>
+        <w:t xml:space="preserve"> kết hợp ngôn ngữ kiểm soát kiểu chặt chẽ </w:t>
+      </w:r>
+      <w:r>
+        <w:rPr>
+          <w:b/>
+        </w:rPr>
+        <w:t xml:space="preserve">TypeScript</w:t>
+      </w:r>
+      <w:r>
+        <w:rPr>
+          <w:b w:val="false"/>
+        </w:rPr>
+        <w:t xml:space="preserve"> giúp tối ưu tốc độ tải trang và đảm bảo độ tin cậy của mã nguồn.</w:t>
+      </w:r>
+    </w:p>
+    <w:p>
+      <w:pPr>
+        <w:spacing w:after="60"/>
+        <w:ind w:left="720"/>
+        <w:jc w:val="both"/>
+      </w:pPr>
+      <w:r>
+        <w:rPr>
+          <w:b w:val="false"/>
+        </w:rPr>
+        <w:t xml:space="preserve">- Cấu trúc biên dịch (build) bằng </w:t>
+      </w:r>
+      <w:r>
+        <w:rPr>
+          <w:b/>
+        </w:rPr>
+        <w:t xml:space="preserve">Vite</w:t>
+      </w:r>
+      <w:r>
+        <w:rPr>
+          <w:b w:val="false"/>
+        </w:rPr>
+        <w:t xml:space="preserve"> tối ưu hóa hiệu năng kết xuất dữ liệu và render biểu đồ thời gian thực.</w:t>
+      </w:r>
+    </w:p>
+    <w:p>
+      <w:pPr>
+        <w:spacing w:after="60"/>
+        <w:ind w:left="720"/>
+        <w:jc w:val="both"/>
+      </w:pPr>
+      <w:r>
+        <w:rPr>
+          <w:b w:val="false"/>
+        </w:rPr>
+        <w:t xml:space="preserve">- Giao diện thiết kế theo triết lý Responsive hiển thị mượt mà trên mọi thiết bị (máy tính để bàn, máy tính bảng, điện thoại di động).</w:t>
       </w:r>
     </w:p>
     <w:p>
@@ -1453,29 +1548,132 @@
         <w:rPr>
           <w:b w:val="false"/>
         </w:rPr>
-        <w:t xml:space="preserve">- Bảo toàn chủ quyền dữ liệu:</w:t>
-      </w:r>
-      <w:r>
-        <w:rPr>
-          <w:b/>
-        </w:rPr>
-        <w:t xml:space="preserve"> Đảm bảo 100% dữ liệu của Viện IBST được lưu trữ vật lý trên các máy chủ đặt tại Việt Nam, tuân thủ tuyệt đối Nghị định 53/2022/NĐ-CP hướng dẫn Luật An ninh mạng.</w:t>
+        <w:t xml:space="preserve">- Lớp Cơ sở dữ liệu &amp; Logic nghiệp vụ (Database &amp; Backend):</w:t>
+      </w:r>
+    </w:p>
+    <w:p>
+      <w:pPr>
+        <w:spacing w:after="60"/>
+        <w:ind w:left="720"/>
+        <w:jc w:val="both"/>
+      </w:pPr>
+      <w:r>
+        <w:rPr>
+          <w:b w:val="false"/>
+        </w:rPr>
+        <w:t xml:space="preserve">- Hệ quản trị cơ sở dữ liệu </w:t>
+      </w:r>
+      <w:r>
+        <w:rPr>
+          <w:b/>
+        </w:rPr>
+        <w:t xml:space="preserve">PostgreSQL</w:t>
+      </w:r>
+      <w:r>
+        <w:rPr>
+          <w:b w:val="false"/>
+        </w:rPr>
+        <w:t xml:space="preserve"> kết hợp công nghệ nền tảng </w:t>
+      </w:r>
+      <w:r>
+        <w:rPr>
+          <w:b/>
+        </w:rPr>
+        <w:t xml:space="preserve">Supabase (phiên bản tự vận hành - Self-hosted)</w:t>
+      </w:r>
+      <w:r>
+        <w:rPr>
+          <w:b w:val="false"/>
+        </w:rPr>
+        <w:t xml:space="preserve"> triển khai trực tiếp trên hạ tầng máy chủ ảo (Cloud VPS/Kubernetes) của nhà cung cấp nội địa.</w:t>
+      </w:r>
+    </w:p>
+    <w:p>
+      <w:pPr>
+        <w:spacing w:after="60"/>
+        <w:ind w:left="720"/>
+        <w:jc w:val="both"/>
+      </w:pPr>
+      <w:r>
+        <w:rPr>
+          <w:b w:val="false"/>
+        </w:rPr>
+        <w:t xml:space="preserve">- Áp dụng cơ chế </w:t>
+      </w:r>
+      <w:r>
+        <w:rPr>
+          <w:b/>
+        </w:rPr>
+        <w:t xml:space="preserve">Row-Level Security (RLS)</w:t>
+      </w:r>
+      <w:r>
+        <w:rPr>
+          <w:b w:val="false"/>
+        </w:rPr>
+        <w:t xml:space="preserve"> ở lớp cơ sở dữ liệu để phân quyền xem/sửa dữ liệu tự động giữa 16 đơn vị trực thuộc, ngăn chặn rò rỉ chéo thông tin tài chính và đề tài khoa học.</w:t>
+      </w:r>
+    </w:p>
+    <w:p>
+      <w:pPr>
+        <w:spacing w:after="60"/>
+        <w:ind w:left="360"/>
+        <w:jc w:val="both"/>
+      </w:pPr>
+      <w:r>
+        <w:rPr>
+          <w:b w:val="false"/>
+        </w:rPr>
+        <w:t xml:space="preserve">- Lớp Liên thông &amp; Tích hợp (API &amp; Integration):</w:t>
+      </w:r>
+    </w:p>
+    <w:p>
+      <w:pPr>
+        <w:spacing w:after="60"/>
+        <w:ind w:left="720"/>
+        <w:jc w:val="both"/>
+      </w:pPr>
+      <w:r>
+        <w:rPr>
+          <w:b w:val="false"/>
+        </w:rPr>
+        <w:t xml:space="preserve">- Giao tiếp dữ liệu bảo mật thông qua giao thức </w:t>
+      </w:r>
+      <w:r>
+        <w:rPr>
+          <w:b/>
+        </w:rPr>
+        <w:t xml:space="preserve">RESTful API</w:t>
+      </w:r>
+      <w:r>
+        <w:rPr>
+          <w:b w:val="false"/>
+        </w:rPr>
+        <w:t xml:space="preserve"> mã hóa SSL/TLS cường độ cao.</w:t>
+      </w:r>
+    </w:p>
+    <w:p>
+      <w:pPr>
+        <w:spacing w:after="60"/>
+        <w:ind w:left="720"/>
+        <w:jc w:val="both"/>
+      </w:pPr>
+      <w:r>
+        <w:rPr>
+          <w:b w:val="false"/>
+        </w:rPr>
+        <w:t xml:space="preserve">- Trục văn bản tích hợp cổng giao tiếp SOAP/REST xử lý gói tin định dạng XML mã hóa theo Thông tư 02/2017/TT-VPCP phục vụ liên thông trực tiếp với Trục văn bản Bộ Xây dựng.</w:t>
       </w:r>
     </w:p>
     <w:p>
       <w:pPr>
         <w:spacing w:before="240" w:after="80"/>
+      </w:pPr>
+      <w:r>
         <w:rPr>
           <w:b/>
           <w:sz w:val="26"/>
         </w:rPr>
-      </w:pPr>
-      <w:r>
-        <w:rPr>
-          <w:b w:val="false"/>
-          <w:sz w:val="26"/>
-        </w:rPr>
-        <w:t xml:space="preserve">Chi tiết Lớp Công nghệ (Technology Stack)</w:t>
+        <w:t xml:space="preserve">3. Tiêu chuẩn An toàn thông tin &amp; Khả năng mở rộng</w:t>
       </w:r>
     </w:p>
     <w:p>
@@ -1488,82 +1686,13 @@
         <w:rPr>
           <w:b w:val="false"/>
         </w:rPr>
-        <w:t xml:space="preserve">- Lớp Giao diện (Frontend Client):</w:t>
-      </w:r>
-    </w:p>
-    <w:p>
-      <w:pPr>
-        <w:spacing w:after="60"/>
-        <w:ind w:left="720"/>
-        <w:jc w:val="both"/>
-      </w:pPr>
-      <w:r>
-        <w:rPr>
-          <w:b w:val="false"/>
-        </w:rPr>
-        <w:t xml:space="preserve">- Sử dụng thư viện </w:t>
-      </w:r>
-      <w:r>
-        <w:rPr>
-          <w:b/>
-        </w:rPr>
-        <w:t xml:space="preserve">React</w:t>
-      </w:r>
-      <w:r>
-        <w:rPr>
-          <w:b w:val="false"/>
-        </w:rPr>
-        <w:t xml:space="preserve"> kết hợp ngôn ngữ kiểm soát kiểu chặt chẽ </w:t>
-      </w:r>
-      <w:r>
-        <w:rPr>
-          <w:b/>
-        </w:rPr>
-        <w:t xml:space="preserve">TypeScript</w:t>
-      </w:r>
-      <w:r>
-        <w:rPr>
-          <w:b w:val="false"/>
-        </w:rPr>
-        <w:t xml:space="preserve"> giúp tối ưu tốc độ tải trang và đảm bảo độ tin cậy của mã nguồn.</w:t>
-      </w:r>
-    </w:p>
-    <w:p>
-      <w:pPr>
-        <w:spacing w:after="60"/>
-        <w:ind w:left="720"/>
-        <w:jc w:val="both"/>
-      </w:pPr>
-      <w:r>
-        <w:rPr>
-          <w:b w:val="false"/>
-        </w:rPr>
-        <w:t xml:space="preserve">- Cấu trúc biên dịch (build) bằng </w:t>
-      </w:r>
-      <w:r>
-        <w:rPr>
-          <w:b/>
-        </w:rPr>
-        <w:t xml:space="preserve">Vite</w:t>
-      </w:r>
-      <w:r>
-        <w:rPr>
-          <w:b w:val="false"/>
-        </w:rPr>
-        <w:t xml:space="preserve"> tối ưu hóa hiệu năng kết xuất dữ liệu và render biểu đồ thời gian thực.</w:t>
-      </w:r>
-    </w:p>
-    <w:p>
-      <w:pPr>
-        <w:spacing w:after="60"/>
-        <w:ind w:left="720"/>
-        <w:jc w:val="both"/>
-      </w:pPr>
-      <w:r>
-        <w:rPr>
-          <w:b w:val="false"/>
-        </w:rPr>
-        <w:t xml:space="preserve">- Giao diện thiết kế theo triết lý Responsive hiển thị mượt mà trên mọi thiết bị (máy tính để bàn, máy tính bảng, điện thoại di động).</w:t>
+        <w:t xml:space="preserve">- Bảo mật đường truyền:</w:t>
+      </w:r>
+      <w:r>
+        <w:rPr>
+          <w:b/>
+        </w:rPr>
+        <w:t xml:space="preserve"> Toàn bộ kết nối được mã hóa HTTPS. Hỗ trợ tích hợp kênh truyền riêng VPN cho các đơn vị cần bảo mật dữ liệu cấp cao.</w:t>
       </w:r>
     </w:p>
     <w:p>
@@ -1576,167 +1705,6 @@
         <w:rPr>
           <w:b w:val="false"/>
         </w:rPr>
-        <w:t xml:space="preserve">- Lớp Cơ sở dữ liệu &amp; Logic nghiệp vụ (Database &amp; Backend):</w:t>
-      </w:r>
-    </w:p>
-    <w:p>
-      <w:pPr>
-        <w:spacing w:after="60"/>
-        <w:ind w:left="720"/>
-        <w:jc w:val="both"/>
-      </w:pPr>
-      <w:r>
-        <w:rPr>
-          <w:b w:val="false"/>
-        </w:rPr>
-        <w:t xml:space="preserve">- Hệ quản trị cơ sở dữ liệu </w:t>
-      </w:r>
-      <w:r>
-        <w:rPr>
-          <w:b/>
-        </w:rPr>
-        <w:t xml:space="preserve">PostgreSQL</w:t>
-      </w:r>
-      <w:r>
-        <w:rPr>
-          <w:b w:val="false"/>
-        </w:rPr>
-        <w:t xml:space="preserve"> kết hợp công nghệ nền tảng </w:t>
-      </w:r>
-      <w:r>
-        <w:rPr>
-          <w:b/>
-        </w:rPr>
-        <w:t xml:space="preserve">Supabase (phiên bản tự vận hành - Self-hosted)</w:t>
-      </w:r>
-      <w:r>
-        <w:rPr>
-          <w:b w:val="false"/>
-        </w:rPr>
-        <w:t xml:space="preserve"> triển khai trực tiếp trên hạ tầng máy chủ ảo (Cloud VPS/Kubernetes) của nhà cung cấp nội địa.</w:t>
-      </w:r>
-    </w:p>
-    <w:p>
-      <w:pPr>
-        <w:spacing w:after="60"/>
-        <w:ind w:left="720"/>
-        <w:jc w:val="both"/>
-      </w:pPr>
-      <w:r>
-        <w:rPr>
-          <w:b w:val="false"/>
-        </w:rPr>
-        <w:t xml:space="preserve">- Áp dụng cơ chế </w:t>
-      </w:r>
-      <w:r>
-        <w:rPr>
-          <w:b/>
-        </w:rPr>
-        <w:t xml:space="preserve">Row-Level Security (RLS)</w:t>
-      </w:r>
-      <w:r>
-        <w:rPr>
-          <w:b w:val="false"/>
-        </w:rPr>
-        <w:t xml:space="preserve"> ở lớp cơ sở dữ liệu để phân quyền xem/sửa dữ liệu tự động giữa 16 đơn vị trực thuộc, ngăn chặn rò rỉ chéo thông tin tài chính và đề tài khoa học.</w:t>
-      </w:r>
-    </w:p>
-    <w:p>
-      <w:pPr>
-        <w:spacing w:after="60"/>
-        <w:ind w:left="360"/>
-        <w:jc w:val="both"/>
-      </w:pPr>
-      <w:r>
-        <w:rPr>
-          <w:b w:val="false"/>
-        </w:rPr>
-        <w:t xml:space="preserve">- Lớp Liên thông &amp; Tích hợp (API &amp; Integration):</w:t>
-      </w:r>
-    </w:p>
-    <w:p>
-      <w:pPr>
-        <w:spacing w:after="60"/>
-        <w:ind w:left="720"/>
-        <w:jc w:val="both"/>
-      </w:pPr>
-      <w:r>
-        <w:rPr>
-          <w:b w:val="false"/>
-        </w:rPr>
-        <w:t xml:space="preserve">- Giao tiếp dữ liệu bảo mật thông qua giao thức </w:t>
-      </w:r>
-      <w:r>
-        <w:rPr>
-          <w:b/>
-        </w:rPr>
-        <w:t xml:space="preserve">RESTful API</w:t>
-      </w:r>
-      <w:r>
-        <w:rPr>
-          <w:b w:val="false"/>
-        </w:rPr>
-        <w:t xml:space="preserve"> mã hóa SSL/TLS cường độ cao.</w:t>
-      </w:r>
-    </w:p>
-    <w:p>
-      <w:pPr>
-        <w:spacing w:after="60"/>
-        <w:ind w:left="720"/>
-        <w:jc w:val="both"/>
-      </w:pPr>
-      <w:r>
-        <w:rPr>
-          <w:b w:val="false"/>
-        </w:rPr>
-        <w:t xml:space="preserve">- Trục văn bản tích hợp cổng giao tiếp SOAP/REST xử lý gói tin định dạng XML mã hóa theo Thông tư 02/2017/TT-VPCP phục vụ liên thông trực tiếp với Trục văn bản Bộ Xây dựng.</w:t>
-      </w:r>
-    </w:p>
-    <w:p>
-      <w:pPr>
-        <w:spacing w:before="240" w:after="80"/>
-        <w:rPr>
-          <w:b/>
-          <w:sz w:val="26"/>
-        </w:rPr>
-      </w:pPr>
-      <w:r>
-        <w:rPr>
-          <w:b w:val="false"/>
-          <w:sz w:val="26"/>
-        </w:rPr>
-        <w:t xml:space="preserve">Tiêu chuẩn An toàn thông tin &amp; Khả năng mở rộng</w:t>
-      </w:r>
-    </w:p>
-    <w:p>
-      <w:pPr>
-        <w:spacing w:after="60"/>
-        <w:ind w:left="360"/>
-        <w:jc w:val="both"/>
-      </w:pPr>
-      <w:r>
-        <w:rPr>
-          <w:b w:val="false"/>
-        </w:rPr>
-        <w:t xml:space="preserve">- Bảo mật đường truyền:</w:t>
-      </w:r>
-      <w:r>
-        <w:rPr>
-          <w:b/>
-        </w:rPr>
-        <w:t xml:space="preserve"> Toàn bộ kết nối được mã hóa HTTPS. Hỗ trợ tích hợp kênh truyền riêng VPN cho các đơn vị cần bảo mật dữ liệu cấp cao.</w:t>
-      </w:r>
-    </w:p>
-    <w:p>
-      <w:pPr>
-        <w:spacing w:after="60"/>
-        <w:ind w:left="360"/>
-        <w:jc w:val="both"/>
-      </w:pPr>
-      <w:r>
-        <w:rPr>
-          <w:b w:val="false"/>
-        </w:rPr>
         <w:t xml:space="preserve">- Kiến trúc mở rộng (Scalability):</w:t>
       </w:r>
       <w:r>
@@ -1747,7 +1715,7 @@
       </w:r>
     </w:p>
     <w:sectPr>
-      <w:footerReference w:type="default" r:id="R425d04ccd8a945e0"/>
+      <w:footerReference w:type="default" r:id="Raf9ceda1a2af463d"/>
       <w:pgSz w:w="11906" w:h="16838"/>
       <w:pgMar w:top="1134" w:right="850" w:bottom="1134" w:left="1701"/>
       <w:docGrid w:type="default"/>

</xml_diff>